<commit_message>
2026 Spring Econometrics Research File update
</commit_message>
<xml_diff>
--- a/static/repo/akek/courses/ekonometri-ars/EC/2_-_Danisman-Ogrenci-Sozlesmesi-Formu_-_Bahar.docx
+++ b/static/repo/akek/courses/ekonometri-ars/EC/2_-_Danisman-Ogrenci-Sozlesmesi-Formu_-_Bahar.docx
@@ -3068,18 +3068,78 @@
                 <w:rFonts w:ascii="Times New Roman" w:hAnsi="Times New Roman" w:cs="Times New Roman"/>
                 <w:sz w:val="24"/>
                 <w:szCs w:val="24"/>
-                <w:lang w:val="tr-TR"/>
               </w:rPr>
             </w:pPr>
-            <w:bookmarkStart w:id="10" w:name="_Hlk211789749"/>
-            <w:r>
-              <w:rPr>
-                <w:rFonts w:ascii="Times New Roman" w:hAnsi="Times New Roman" w:cs="Times New Roman"/>
-                <w:sz w:val="24"/>
-                <w:szCs w:val="24"/>
-                <w:lang w:val="tr-TR"/>
-              </w:rPr>
-              <w:t>Konu Seçimi Açıklaması</w:t>
+            <w:bookmarkStart w:id="10" w:name="_Hlk211788480"/>
+            <w:r>
+              <w:rPr>
+                <w:rFonts w:ascii="Times New Roman" w:hAnsi="Times New Roman" w:cs="Times New Roman"/>
+                <w:sz w:val="24"/>
+                <w:szCs w:val="24"/>
+                <w:lang w:val="tr-TR"/>
+              </w:rPr>
+              <w:t xml:space="preserve">Ara Sınav </w:t>
+            </w:r>
+            <w:r>
+              <w:rPr>
+                <w:rFonts w:ascii="Times New Roman" w:hAnsi="Times New Roman" w:cs="Times New Roman"/>
+                <w:sz w:val="24"/>
+                <w:szCs w:val="24"/>
+              </w:rPr>
+              <w:t>(</w:t>
+            </w:r>
+            <w:proofErr w:type="spellStart"/>
+            <w:r>
+              <w:rPr>
+                <w:rFonts w:ascii="Times New Roman" w:hAnsi="Times New Roman" w:cs="Times New Roman"/>
+                <w:sz w:val="24"/>
+                <w:szCs w:val="24"/>
+              </w:rPr>
+              <w:t>Makalenin</w:t>
+            </w:r>
+            <w:proofErr w:type="spellEnd"/>
+            <w:r>
+              <w:rPr>
+                <w:rFonts w:ascii="Times New Roman" w:hAnsi="Times New Roman" w:cs="Times New Roman"/>
+                <w:sz w:val="24"/>
+                <w:szCs w:val="24"/>
+              </w:rPr>
+              <w:t xml:space="preserve"> </w:t>
+            </w:r>
+            <w:proofErr w:type="spellStart"/>
+            <w:r>
+              <w:rPr>
+                <w:rFonts w:ascii="Times New Roman" w:hAnsi="Times New Roman" w:cs="Times New Roman"/>
+                <w:sz w:val="24"/>
+                <w:szCs w:val="24"/>
+              </w:rPr>
+              <w:t>üçüncü</w:t>
+            </w:r>
+            <w:proofErr w:type="spellEnd"/>
+            <w:r>
+              <w:rPr>
+                <w:rFonts w:ascii="Times New Roman" w:hAnsi="Times New Roman" w:cs="Times New Roman"/>
+                <w:sz w:val="24"/>
+                <w:szCs w:val="24"/>
+              </w:rPr>
+              <w:t xml:space="preserve"> </w:t>
+            </w:r>
+            <w:r>
+              <w:rPr>
+                <w:rFonts w:ascii="Times New Roman" w:hAnsi="Times New Roman" w:cs="Times New Roman"/>
+                <w:sz w:val="24"/>
+                <w:szCs w:val="24"/>
+                <w:lang w:val="tr-TR"/>
+              </w:rPr>
+              <w:t>çeyreği</w:t>
+            </w:r>
+            <w:r>
+              <w:rPr>
+                <w:rFonts w:ascii="Times New Roman" w:hAnsi="Times New Roman" w:cs="Times New Roman"/>
+                <w:sz w:val="24"/>
+                <w:szCs w:val="24"/>
+              </w:rPr>
+              <w:t>)</w:t>
             </w:r>
           </w:p>
         </w:tc>
@@ -3102,8 +3162,240 @@
                 <w:szCs w:val="24"/>
                 <w:lang w:val="tr-TR"/>
               </w:rPr>
-              <w:t>10/10/2025</w:t>
-            </w:r>
+              <w:t>1</w:t>
+            </w:r>
+            <w:r>
+              <w:rPr>
+                <w:rFonts w:ascii="Times New Roman" w:hAnsi="Times New Roman" w:cs="Times New Roman"/>
+                <w:sz w:val="24"/>
+                <w:szCs w:val="24"/>
+                <w:lang w:val="tr-TR"/>
+              </w:rPr>
+              <w:t>0</w:t>
+            </w:r>
+            <w:r>
+              <w:rPr>
+                <w:rFonts w:ascii="Times New Roman" w:hAnsi="Times New Roman" w:cs="Times New Roman"/>
+                <w:sz w:val="24"/>
+                <w:szCs w:val="24"/>
+                <w:lang w:val="tr-TR"/>
+              </w:rPr>
+              <w:t>/</w:t>
+            </w:r>
+            <w:r>
+              <w:rPr>
+                <w:rFonts w:ascii="Times New Roman" w:hAnsi="Times New Roman" w:cs="Times New Roman"/>
+                <w:sz w:val="24"/>
+                <w:szCs w:val="24"/>
+                <w:lang w:val="tr-TR"/>
+              </w:rPr>
+              <w:t>04</w:t>
+            </w:r>
+            <w:r>
+              <w:rPr>
+                <w:rFonts w:ascii="Times New Roman" w:hAnsi="Times New Roman" w:cs="Times New Roman"/>
+                <w:sz w:val="24"/>
+                <w:szCs w:val="24"/>
+                <w:lang w:val="tr-TR"/>
+              </w:rPr>
+              <w:t>/202</w:t>
+            </w:r>
+            <w:r>
+              <w:rPr>
+                <w:rFonts w:ascii="Times New Roman" w:hAnsi="Times New Roman" w:cs="Times New Roman"/>
+                <w:sz w:val="24"/>
+                <w:szCs w:val="24"/>
+                <w:lang w:val="tr-TR"/>
+              </w:rPr>
+              <w:t>6</w:t>
+            </w:r>
+            <w:r>
+              <w:rPr>
+                <w:rFonts w:ascii="Times New Roman" w:hAnsi="Times New Roman" w:cs="Times New Roman"/>
+                <w:sz w:val="24"/>
+                <w:szCs w:val="24"/>
+                <w:lang w:val="tr-TR"/>
+              </w:rPr>
+              <w:t xml:space="preserve"> </w:t>
+            </w:r>
+            <w:r>
+              <w:rPr>
+                <w:rFonts w:ascii="Times New Roman" w:hAnsi="Times New Roman" w:cs="Times New Roman"/>
+                <w:b/>
+                <w:bCs/>
+                <w:color w:val="EE0000"/>
+                <w:sz w:val="24"/>
+                <w:szCs w:val="24"/>
+              </w:rPr>
+              <w:t>(D</w:t>
+            </w:r>
+            <w:proofErr w:type="spellStart"/>
+            <w:r>
+              <w:rPr>
+                <w:rFonts w:ascii="Times New Roman" w:hAnsi="Times New Roman" w:cs="Times New Roman"/>
+                <w:b/>
+                <w:bCs/>
+                <w:color w:val="EE0000"/>
+                <w:sz w:val="24"/>
+                <w:szCs w:val="24"/>
+                <w:lang w:val="tr-TR"/>
+              </w:rPr>
+              <w:t>üzeltin</w:t>
+            </w:r>
+            <w:proofErr w:type="spellEnd"/>
+            <w:r>
+              <w:rPr>
+                <w:rFonts w:ascii="Times New Roman" w:hAnsi="Times New Roman" w:cs="Times New Roman"/>
+                <w:b/>
+                <w:bCs/>
+                <w:color w:val="EE0000"/>
+                <w:sz w:val="24"/>
+                <w:szCs w:val="24"/>
+              </w:rPr>
+              <w:t>)</w:t>
+            </w:r>
+          </w:p>
+        </w:tc>
+      </w:tr>
+      <w:bookmarkEnd w:id="10"/>
+      <w:tr>
+        <w:tc>
+          <w:tcPr>
+            <w:tcW w:w="4320" w:type="dxa"/>
+          </w:tcPr>
+          <w:p>
+            <w:pPr>
+              <w:rPr>
+                <w:rFonts w:ascii="Times New Roman" w:hAnsi="Times New Roman" w:cs="Times New Roman"/>
+                <w:sz w:val="24"/>
+                <w:szCs w:val="24"/>
+              </w:rPr>
+            </w:pPr>
+            <w:r>
+              <w:rPr>
+                <w:rFonts w:ascii="Times New Roman" w:hAnsi="Times New Roman" w:cs="Times New Roman"/>
+                <w:sz w:val="24"/>
+                <w:szCs w:val="24"/>
+                <w:lang w:val="tr-TR"/>
+              </w:rPr>
+              <w:t xml:space="preserve">Sunum (Makalenin </w:t>
+            </w:r>
+            <w:bookmarkStart w:id="11" w:name="_Hlk225320733"/>
+            <w:r>
+              <w:rPr>
+                <w:rFonts w:ascii="Times New Roman" w:hAnsi="Times New Roman" w:cs="Times New Roman"/>
+                <w:sz w:val="24"/>
+                <w:szCs w:val="24"/>
+                <w:lang w:val="tr-TR"/>
+              </w:rPr>
+              <w:t>i</w:t>
+            </w:r>
+            <w:r>
+              <w:rPr>
+                <w:rFonts w:ascii="Times New Roman" w:hAnsi="Times New Roman" w:cs="Times New Roman"/>
+                <w:sz w:val="24"/>
+                <w:szCs w:val="24"/>
+                <w:lang w:val="tr-TR"/>
+              </w:rPr>
+              <w:t>kinci</w:t>
+            </w:r>
+            <w:bookmarkEnd w:id="11"/>
+            <w:r>
+              <w:rPr>
+                <w:rFonts w:ascii="Times New Roman" w:hAnsi="Times New Roman" w:cs="Times New Roman"/>
+                <w:sz w:val="24"/>
+                <w:szCs w:val="24"/>
+                <w:lang w:val="tr-TR"/>
+              </w:rPr>
+              <w:t xml:space="preserve"> yarısı</w:t>
+            </w:r>
+            <w:r>
+              <w:rPr>
+                <w:rFonts w:ascii="Times New Roman" w:hAnsi="Times New Roman" w:cs="Times New Roman"/>
+                <w:sz w:val="24"/>
+                <w:szCs w:val="24"/>
+              </w:rPr>
+              <w:t>)</w:t>
+            </w:r>
+          </w:p>
+        </w:tc>
+        <w:tc>
+          <w:tcPr>
+            <w:tcW w:w="4577" w:type="dxa"/>
+          </w:tcPr>
+          <w:p>
+            <w:pPr>
+              <w:rPr>
+                <w:rFonts w:ascii="Times New Roman" w:hAnsi="Times New Roman" w:cs="Times New Roman"/>
+                <w:sz w:val="24"/>
+                <w:szCs w:val="24"/>
+              </w:rPr>
+            </w:pPr>
+            <w:bookmarkStart w:id="12" w:name="_Hlk211789777"/>
+            <w:r>
+              <w:rPr>
+                <w:rFonts w:ascii="Times New Roman" w:hAnsi="Times New Roman" w:cs="Times New Roman"/>
+                <w:sz w:val="24"/>
+                <w:szCs w:val="24"/>
+                <w:lang w:val="tr-TR"/>
+              </w:rPr>
+              <w:t>0</w:t>
+            </w:r>
+            <w:r>
+              <w:rPr>
+                <w:rFonts w:ascii="Times New Roman" w:hAnsi="Times New Roman" w:cs="Times New Roman"/>
+                <w:sz w:val="24"/>
+                <w:szCs w:val="24"/>
+                <w:lang w:val="tr-TR"/>
+              </w:rPr>
+              <w:t>5</w:t>
+            </w:r>
+            <w:r>
+              <w:rPr>
+                <w:rFonts w:ascii="Times New Roman" w:hAnsi="Times New Roman" w:cs="Times New Roman"/>
+                <w:sz w:val="24"/>
+                <w:szCs w:val="24"/>
+                <w:lang w:val="tr-TR"/>
+              </w:rPr>
+              <w:t>/</w:t>
+            </w:r>
+            <w:r>
+              <w:rPr>
+                <w:rFonts w:ascii="Times New Roman" w:hAnsi="Times New Roman" w:cs="Times New Roman"/>
+                <w:sz w:val="24"/>
+                <w:szCs w:val="24"/>
+                <w:lang w:val="tr-TR"/>
+              </w:rPr>
+              <w:t>0</w:t>
+            </w:r>
+            <w:r>
+              <w:rPr>
+                <w:rFonts w:ascii="Times New Roman" w:hAnsi="Times New Roman" w:cs="Times New Roman"/>
+                <w:sz w:val="24"/>
+                <w:szCs w:val="24"/>
+                <w:lang w:val="tr-TR"/>
+              </w:rPr>
+              <w:t>6</w:t>
+            </w:r>
+            <w:r>
+              <w:rPr>
+                <w:rFonts w:ascii="Times New Roman" w:hAnsi="Times New Roman" w:cs="Times New Roman"/>
+                <w:sz w:val="24"/>
+                <w:szCs w:val="24"/>
+                <w:lang w:val="tr-TR"/>
+              </w:rPr>
+              <w:t>/202</w:t>
+            </w:r>
+            <w:r>
+              <w:rPr>
+                <w:rFonts w:ascii="Times New Roman" w:hAnsi="Times New Roman" w:cs="Times New Roman"/>
+                <w:sz w:val="24"/>
+                <w:szCs w:val="24"/>
+                <w:lang w:val="tr-TR"/>
+              </w:rPr>
+              <w:t>6</w:t>
+            </w:r>
+            <w:bookmarkEnd w:id="12"/>
             <w:r>
               <w:rPr>
                 <w:rFonts w:ascii="Times New Roman" w:hAnsi="Times New Roman" w:cs="Times New Roman"/>
@@ -3165,16 +3457,14 @@
                 <w:szCs w:val="24"/>
               </w:rPr>
             </w:pPr>
-            <w:bookmarkStart w:id="11" w:name="_Hlk211788480"/>
-            <w:bookmarkEnd w:id="10"/>
-            <w:r>
-              <w:rPr>
-                <w:rFonts w:ascii="Times New Roman" w:hAnsi="Times New Roman" w:cs="Times New Roman"/>
-                <w:sz w:val="24"/>
-                <w:szCs w:val="24"/>
-                <w:lang w:val="tr-TR"/>
-              </w:rPr>
-              <w:t xml:space="preserve">Ara Sınav </w:t>
+            <w:r>
+              <w:rPr>
+                <w:rFonts w:ascii="Times New Roman" w:hAnsi="Times New Roman" w:cs="Times New Roman"/>
+                <w:sz w:val="24"/>
+                <w:szCs w:val="24"/>
+                <w:lang w:val="tr-TR"/>
+              </w:rPr>
+              <w:t xml:space="preserve">Final Sınavı </w:t>
             </w:r>
             <w:r>
               <w:rPr>
@@ -3200,16 +3490,33 @@
                 <w:sz w:val="24"/>
                 <w:szCs w:val="24"/>
               </w:rPr>
-              <w:t xml:space="preserve"> ilk </w:t>
-            </w:r>
-            <w:r>
-              <w:rPr>
-                <w:rFonts w:ascii="Times New Roman" w:hAnsi="Times New Roman" w:cs="Times New Roman"/>
-                <w:sz w:val="24"/>
-                <w:szCs w:val="24"/>
-                <w:lang w:val="tr-TR"/>
-              </w:rPr>
-              <w:t>çeyreği</w:t>
+              <w:t xml:space="preserve"> </w:t>
+            </w:r>
+            <w:r>
+              <w:rPr>
+                <w:rFonts w:ascii="Times New Roman" w:hAnsi="Times New Roman" w:cs="Times New Roman"/>
+                <w:sz w:val="24"/>
+                <w:szCs w:val="24"/>
+                <w:lang w:val="tr-TR"/>
+              </w:rPr>
+              <w:t>ikinci</w:t>
+            </w:r>
+            <w:r>
+              <w:rPr>
+                <w:rFonts w:ascii="Times New Roman" w:hAnsi="Times New Roman" w:cs="Times New Roman"/>
+                <w:sz w:val="24"/>
+                <w:szCs w:val="24"/>
+              </w:rPr>
+              <w:t xml:space="preserve"> </w:t>
+            </w:r>
+            <w:r>
+              <w:rPr>
+                <w:rFonts w:ascii="Times New Roman" w:hAnsi="Times New Roman" w:cs="Times New Roman"/>
+                <w:sz w:val="24"/>
+                <w:szCs w:val="24"/>
+                <w:lang w:val="tr-TR"/>
+              </w:rPr>
+              <w:t>yarısı</w:t>
             </w:r>
             <w:r>
               <w:rPr>
@@ -3240,173 +3547,16 @@
                 <w:szCs w:val="24"/>
                 <w:lang w:val="tr-TR"/>
               </w:rPr>
-              <w:t>1</w:t>
-            </w:r>
-            <w:r>
-              <w:rPr>
-                <w:rFonts w:ascii="Times New Roman" w:hAnsi="Times New Roman" w:cs="Times New Roman"/>
-                <w:sz w:val="24"/>
-                <w:szCs w:val="24"/>
-                <w:lang w:val="tr-TR"/>
-              </w:rPr>
-              <w:t>4</w:t>
-            </w:r>
-            <w:r>
-              <w:rPr>
-                <w:rFonts w:ascii="Times New Roman" w:hAnsi="Times New Roman" w:cs="Times New Roman"/>
-                <w:sz w:val="24"/>
-                <w:szCs w:val="24"/>
-                <w:lang w:val="tr-TR"/>
-              </w:rPr>
-              <w:t>/1</w:t>
-            </w:r>
-            <w:r>
-              <w:rPr>
-                <w:rFonts w:ascii="Times New Roman" w:hAnsi="Times New Roman" w:cs="Times New Roman"/>
-                <w:sz w:val="24"/>
-                <w:szCs w:val="24"/>
-                <w:lang w:val="tr-TR"/>
-              </w:rPr>
-              <w:t>1</w:t>
-            </w:r>
-            <w:r>
-              <w:rPr>
-                <w:rFonts w:ascii="Times New Roman" w:hAnsi="Times New Roman" w:cs="Times New Roman"/>
-                <w:sz w:val="24"/>
-                <w:szCs w:val="24"/>
-                <w:lang w:val="tr-TR"/>
-              </w:rPr>
-              <w:t>/2025</w:t>
-            </w:r>
-            <w:r>
-              <w:rPr>
-                <w:rFonts w:ascii="Times New Roman" w:hAnsi="Times New Roman" w:cs="Times New Roman"/>
-                <w:sz w:val="24"/>
-                <w:szCs w:val="24"/>
-                <w:lang w:val="tr-TR"/>
-              </w:rPr>
-              <w:t xml:space="preserve"> </w:t>
-            </w:r>
-            <w:r>
-              <w:rPr>
-                <w:rFonts w:ascii="Times New Roman" w:hAnsi="Times New Roman" w:cs="Times New Roman"/>
-                <w:b/>
-                <w:bCs/>
-                <w:color w:val="EE0000"/>
-                <w:sz w:val="24"/>
-                <w:szCs w:val="24"/>
-              </w:rPr>
-              <w:t>(D</w:t>
-            </w:r>
-            <w:proofErr w:type="spellStart"/>
-            <w:r>
-              <w:rPr>
-                <w:rFonts w:ascii="Times New Roman" w:hAnsi="Times New Roman" w:cs="Times New Roman"/>
-                <w:b/>
-                <w:bCs/>
-                <w:color w:val="EE0000"/>
-                <w:sz w:val="24"/>
-                <w:szCs w:val="24"/>
-                <w:lang w:val="tr-TR"/>
-              </w:rPr>
-              <w:t>üzeltin</w:t>
-            </w:r>
-            <w:proofErr w:type="spellEnd"/>
-            <w:r>
-              <w:rPr>
-                <w:rFonts w:ascii="Times New Roman" w:hAnsi="Times New Roman" w:cs="Times New Roman"/>
-                <w:b/>
-                <w:bCs/>
-                <w:color w:val="EE0000"/>
-                <w:sz w:val="24"/>
-                <w:szCs w:val="24"/>
-              </w:rPr>
-              <w:t>)</w:t>
-            </w:r>
-          </w:p>
-        </w:tc>
-      </w:tr>
-      <w:bookmarkEnd w:id="11"/>
-      <w:tr>
-        <w:tc>
-          <w:tcPr>
-            <w:tcW w:w="4320" w:type="dxa"/>
-          </w:tcPr>
-          <w:p>
-            <w:pPr>
-              <w:rPr>
-                <w:rFonts w:ascii="Times New Roman" w:hAnsi="Times New Roman" w:cs="Times New Roman"/>
-                <w:sz w:val="24"/>
-                <w:szCs w:val="24"/>
-              </w:rPr>
-            </w:pPr>
-            <w:r>
-              <w:rPr>
-                <w:rFonts w:ascii="Times New Roman" w:hAnsi="Times New Roman" w:cs="Times New Roman"/>
-                <w:sz w:val="24"/>
-                <w:szCs w:val="24"/>
-                <w:lang w:val="tr-TR"/>
-              </w:rPr>
-              <w:t>Sunum (Makalenin ilk yarısı</w:t>
-            </w:r>
-            <w:r>
-              <w:rPr>
-                <w:rFonts w:ascii="Times New Roman" w:hAnsi="Times New Roman" w:cs="Times New Roman"/>
-                <w:sz w:val="24"/>
-                <w:szCs w:val="24"/>
-              </w:rPr>
-              <w:t>)</w:t>
-            </w:r>
-          </w:p>
-        </w:tc>
-        <w:tc>
-          <w:tcPr>
-            <w:tcW w:w="4577" w:type="dxa"/>
-          </w:tcPr>
-          <w:p>
-            <w:pPr>
-              <w:rPr>
-                <w:rFonts w:ascii="Times New Roman" w:hAnsi="Times New Roman" w:cs="Times New Roman"/>
-                <w:sz w:val="24"/>
-                <w:szCs w:val="24"/>
-              </w:rPr>
-            </w:pPr>
-            <w:bookmarkStart w:id="12" w:name="_Hlk211789777"/>
-            <w:r>
-              <w:rPr>
-                <w:rFonts w:ascii="Times New Roman" w:hAnsi="Times New Roman" w:cs="Times New Roman"/>
-                <w:sz w:val="24"/>
-                <w:szCs w:val="24"/>
-                <w:lang w:val="tr-TR"/>
-              </w:rPr>
-              <w:t>02</w:t>
-            </w:r>
-            <w:r>
-              <w:rPr>
-                <w:rFonts w:ascii="Times New Roman" w:hAnsi="Times New Roman" w:cs="Times New Roman"/>
-                <w:sz w:val="24"/>
-                <w:szCs w:val="24"/>
-                <w:lang w:val="tr-TR"/>
-              </w:rPr>
-              <w:t>/</w:t>
-            </w:r>
-            <w:r>
-              <w:rPr>
-                <w:rFonts w:ascii="Times New Roman" w:hAnsi="Times New Roman" w:cs="Times New Roman"/>
-                <w:sz w:val="24"/>
-                <w:szCs w:val="24"/>
-                <w:lang w:val="tr-TR"/>
-              </w:rPr>
-              <w:t>01</w:t>
-            </w:r>
-            <w:r>
-              <w:rPr>
-                <w:rFonts w:ascii="Times New Roman" w:hAnsi="Times New Roman" w:cs="Times New Roman"/>
-                <w:sz w:val="24"/>
-                <w:szCs w:val="24"/>
-                <w:lang w:val="tr-TR"/>
-              </w:rPr>
-              <w:t>/202</w:t>
+              <w:t>12</w:t>
+            </w:r>
+            <w:r>
+              <w:rPr>
+                <w:rFonts w:ascii="Times New Roman" w:hAnsi="Times New Roman" w:cs="Times New Roman"/>
+                <w:sz w:val="24"/>
+                <w:szCs w:val="24"/>
+                <w:lang w:val="tr-TR"/>
+              </w:rPr>
+              <w:t>/0</w:t>
             </w:r>
             <w:r>
               <w:rPr>
@@ -3417,142 +3567,14 @@
               </w:rPr>
               <w:t>6</w:t>
             </w:r>
-            <w:bookmarkEnd w:id="12"/>
-            <w:r>
-              <w:rPr>
-                <w:rFonts w:ascii="Times New Roman" w:hAnsi="Times New Roman" w:cs="Times New Roman"/>
-                <w:sz w:val="24"/>
-                <w:szCs w:val="24"/>
-                <w:lang w:val="tr-TR"/>
-              </w:rPr>
-              <w:t xml:space="preserve"> </w:t>
-            </w:r>
-            <w:r>
-              <w:rPr>
-                <w:rFonts w:ascii="Times New Roman" w:hAnsi="Times New Roman" w:cs="Times New Roman"/>
-                <w:b/>
-                <w:bCs/>
-                <w:color w:val="EE0000"/>
-                <w:sz w:val="24"/>
-                <w:szCs w:val="24"/>
-              </w:rPr>
-              <w:t>(D</w:t>
-            </w:r>
-            <w:proofErr w:type="spellStart"/>
-            <w:r>
-              <w:rPr>
-                <w:rFonts w:ascii="Times New Roman" w:hAnsi="Times New Roman" w:cs="Times New Roman"/>
-                <w:b/>
-                <w:bCs/>
-                <w:color w:val="EE0000"/>
-                <w:sz w:val="24"/>
-                <w:szCs w:val="24"/>
-                <w:lang w:val="tr-TR"/>
-              </w:rPr>
-              <w:t>üzeltin</w:t>
-            </w:r>
-            <w:proofErr w:type="spellEnd"/>
-            <w:r>
-              <w:rPr>
-                <w:rFonts w:ascii="Times New Roman" w:hAnsi="Times New Roman" w:cs="Times New Roman"/>
-                <w:b/>
-                <w:bCs/>
-                <w:color w:val="EE0000"/>
-                <w:sz w:val="24"/>
-                <w:szCs w:val="24"/>
-              </w:rPr>
-              <w:t>)</w:t>
-            </w:r>
-          </w:p>
-        </w:tc>
-      </w:tr>
-      <w:tr>
-        <w:tc>
-          <w:tcPr>
-            <w:tcW w:w="4320" w:type="dxa"/>
-          </w:tcPr>
-          <w:p>
-            <w:pPr>
-              <w:rPr>
-                <w:rFonts w:ascii="Times New Roman" w:hAnsi="Times New Roman" w:cs="Times New Roman"/>
-                <w:sz w:val="24"/>
-                <w:szCs w:val="24"/>
-              </w:rPr>
-            </w:pPr>
-            <w:r>
-              <w:rPr>
-                <w:rFonts w:ascii="Times New Roman" w:hAnsi="Times New Roman" w:cs="Times New Roman"/>
-                <w:sz w:val="24"/>
-                <w:szCs w:val="24"/>
-                <w:lang w:val="tr-TR"/>
-              </w:rPr>
-              <w:t xml:space="preserve">Final Sınavı </w:t>
-            </w:r>
-            <w:r>
-              <w:rPr>
-                <w:rFonts w:ascii="Times New Roman" w:hAnsi="Times New Roman" w:cs="Times New Roman"/>
-                <w:sz w:val="24"/>
-                <w:szCs w:val="24"/>
-              </w:rPr>
-              <w:t>(</w:t>
-            </w:r>
-            <w:proofErr w:type="spellStart"/>
-            <w:r>
-              <w:rPr>
-                <w:rFonts w:ascii="Times New Roman" w:hAnsi="Times New Roman" w:cs="Times New Roman"/>
-                <w:sz w:val="24"/>
-                <w:szCs w:val="24"/>
-              </w:rPr>
-              <w:t>Makalenin</w:t>
-            </w:r>
-            <w:proofErr w:type="spellEnd"/>
-            <w:r>
-              <w:rPr>
-                <w:rFonts w:ascii="Times New Roman" w:hAnsi="Times New Roman" w:cs="Times New Roman"/>
-                <w:sz w:val="24"/>
-                <w:szCs w:val="24"/>
-              </w:rPr>
-              <w:t xml:space="preserve"> ilk </w:t>
-            </w:r>
-            <w:r>
-              <w:rPr>
-                <w:rFonts w:ascii="Times New Roman" w:hAnsi="Times New Roman" w:cs="Times New Roman"/>
-                <w:sz w:val="24"/>
-                <w:szCs w:val="24"/>
-                <w:lang w:val="tr-TR"/>
-              </w:rPr>
-              <w:t>yarısı</w:t>
-            </w:r>
-            <w:r>
-              <w:rPr>
-                <w:rFonts w:ascii="Times New Roman" w:hAnsi="Times New Roman" w:cs="Times New Roman"/>
-                <w:sz w:val="24"/>
-                <w:szCs w:val="24"/>
-              </w:rPr>
-              <w:t>)</w:t>
-            </w:r>
-          </w:p>
-        </w:tc>
-        <w:tc>
-          <w:tcPr>
-            <w:tcW w:w="4577" w:type="dxa"/>
-          </w:tcPr>
-          <w:p>
-            <w:pPr>
-              <w:rPr>
-                <w:rFonts w:ascii="Times New Roman" w:hAnsi="Times New Roman" w:cs="Times New Roman"/>
-                <w:sz w:val="24"/>
-                <w:szCs w:val="24"/>
-              </w:rPr>
-            </w:pPr>
-            <w:r>
-              <w:rPr>
-                <w:rFonts w:ascii="Times New Roman" w:hAnsi="Times New Roman" w:cs="Times New Roman"/>
-                <w:sz w:val="24"/>
-                <w:szCs w:val="24"/>
-                <w:lang w:val="tr-TR"/>
-              </w:rPr>
-              <w:t>09/01/2026</w:t>
+            <w:r>
+              <w:rPr>
+                <w:rFonts w:ascii="Times New Roman" w:hAnsi="Times New Roman" w:cs="Times New Roman"/>
+                <w:sz w:val="24"/>
+                <w:szCs w:val="24"/>
+                <w:lang w:val="tr-TR"/>
+              </w:rPr>
+              <w:t>/2026</w:t>
             </w:r>
             <w:r>
               <w:rPr>

</xml_diff>